<commit_message>
updated responses, moved tables and figures into folder
</commit_message>
<xml_diff>
--- a/Paper/Liver_Disease_Paper/Frontiers/Submission_1/Liver_Disease_Segmentation_Paper_Addressed.docx
+++ b/Paper/Liver_Disease_Paper/Frontiers/Submission_1/Liver_Disease_Segmentation_Paper_Addressed.docx
@@ -1,6 +1,6 @@
 
 <file path=word/document.xml><?xml version="1.0" encoding="utf-8"?>
-<w:document xmlns:wpc="http://schemas.microsoft.com/office/word/2010/wordprocessingCanvas" xmlns:cx="http://schemas.microsoft.com/office/drawing/2014/chartex" xmlns:cx1="http://schemas.microsoft.com/office/drawing/2015/9/8/chartex" xmlns:cx2="http://schemas.microsoft.com/office/drawing/2015/10/21/chartex" xmlns:cx3="http://schemas.microsoft.com/office/drawing/2016/5/9/chartex" xmlns:cx4="http://schemas.microsoft.com/office/drawing/2016/5/10/chartex" xmlns:cx5="http://schemas.microsoft.com/office/drawing/2016/5/11/chartex" xmlns:cx6="http://schemas.microsoft.com/office/drawing/2016/5/12/chartex" xmlns:cx7="http://schemas.microsoft.com/office/drawing/2016/5/13/chartex" xmlns:cx8="http://schemas.microsoft.com/office/drawing/2016/5/14/chartex" xmlns:mc="http://schemas.openxmlformats.org/markup-compatibility/2006" xmlns:aink="http://schemas.microsoft.com/office/drawing/2016/ink" xmlns:am3d="http://schemas.microsoft.com/office/drawing/2017/model3d" xmlns:o="urn:schemas-microsoft-com:office:office" xmlns:r="http://schemas.openxmlformats.org/officeDocument/2006/relationships" xmlns:m="http://schemas.openxmlformats.org/officeDocument/2006/math" xmlns:v="urn:schemas-microsoft-com:vml" xmlns:wp14="http://schemas.microsoft.com/office/word/2010/wordprocessingDrawing" xmlns:wp="http://schemas.openxmlformats.org/drawingml/2006/wordprocessingDrawing" xmlns:w10="urn:schemas-microsoft-com:office:word" xmlns:w="http://schemas.openxmlformats.org/wordprocessingml/2006/main" xmlns:w14="http://schemas.microsoft.com/office/word/2010/wordml" xmlns:w15="http://schemas.microsoft.com/office/word/2012/wordml" xmlns:w16cex="http://schemas.microsoft.com/office/word/2018/wordml/cex" xmlns:w16cid="http://schemas.microsoft.com/office/word/2016/wordml/cid" xmlns:w16="http://schemas.microsoft.com/office/word/2018/wordml" xmlns:w16sdtdh="http://schemas.microsoft.com/office/word/2020/wordml/sdtdatahash" xmlns:w16se="http://schemas.microsoft.com/office/word/2015/wordml/symex" xmlns:wpg="http://schemas.microsoft.com/office/word/2010/wordprocessingGroup" xmlns:wpi="http://schemas.microsoft.com/office/word/2010/wordprocessingInk" xmlns:wne="http://schemas.microsoft.com/office/word/2006/wordml" xmlns:wps="http://schemas.microsoft.com/office/word/2010/wordprocessingShape" mc:Ignorable="w14 w15 w16se w16cid w16 w16cex w16sdtdh wp14">
+<w:document xmlns:wpc="http://schemas.microsoft.com/office/word/2010/wordprocessingCanvas" xmlns:cx="http://schemas.microsoft.com/office/drawing/2014/chartex" xmlns:cx1="http://schemas.microsoft.com/office/drawing/2015/9/8/chartex" xmlns:mc="http://schemas.openxmlformats.org/markup-compatibility/2006" xmlns:o="urn:schemas-microsoft-com:office:office" xmlns:r="http://schemas.openxmlformats.org/officeDocument/2006/relationships" xmlns:m="http://schemas.openxmlformats.org/officeDocument/2006/math" xmlns:v="urn:schemas-microsoft-com:vml" xmlns:wp14="http://schemas.microsoft.com/office/word/2010/wordprocessingDrawing" xmlns:wp="http://schemas.openxmlformats.org/drawingml/2006/wordprocessingDrawing" xmlns:w10="urn:schemas-microsoft-com:office:word" xmlns:w="http://schemas.openxmlformats.org/wordprocessingml/2006/main" xmlns:w14="http://schemas.microsoft.com/office/word/2010/wordml" xmlns:w15="http://schemas.microsoft.com/office/word/2012/wordml" xmlns:w16se="http://schemas.microsoft.com/office/word/2015/wordml/symex" xmlns:wpg="http://schemas.microsoft.com/office/word/2010/wordprocessingGroup" xmlns:wpi="http://schemas.microsoft.com/office/word/2010/wordprocessingInk" xmlns:wne="http://schemas.microsoft.com/office/word/2006/wordml" xmlns:wps="http://schemas.microsoft.com/office/word/2010/wordprocessingShape" mc:Ignorable="w14 w15 w16se wp14">
   <w:body>
     <w:p>
       <w:pPr>
@@ -95,15 +95,15 @@
       </w:r>
       <w:proofErr w:type="spellEnd"/>
       <w:r>
-        <w:t xml:space="preserve">. On a patient-by-patient basis in the 3D-IRCADb dataset, the median(min-max) Dice similarity </w:t>
+        <w:t xml:space="preserve">. On a patient-by-patient basis in the 3D-IRCADb dataset, the </w:t>
       </w:r>
       <w:proofErr w:type="gramStart"/>
       <w:r>
-        <w:t>coefficient(</w:t>
+        <w:t>median(</w:t>
       </w:r>
       <w:proofErr w:type="gramEnd"/>
       <w:r>
-        <w:t xml:space="preserve">DSC) was 0.73(0.41-0.88), median surface distance was 1.75mm(0.57–7.63mm), and number of false-positives was 1(0-4). In the </w:t>
+        <w:t xml:space="preserve">min-max) Dice similarity coefficient(DSC) was 0.73(0.41-0.88), median surface distance was 1.75mm(0.57–7.63mm), and number of false-positives was 1(0-4). In the </w:t>
       </w:r>
       <w:proofErr w:type="spellStart"/>
       <w:r>
@@ -111,23 +111,23 @@
       </w:r>
       <w:proofErr w:type="spellEnd"/>
       <w:r>
-        <w:t xml:space="preserve"> challenge(n=70), the global DSC was 0.810.  The model sensitivity was 98</w:t>
+        <w:t xml:space="preserve"> challenge(n=70), the global DSC was 0.810.  The model sensitivity was </w:t>
       </w:r>
       <w:proofErr w:type="gramStart"/>
       <w:r>
-        <w:t>%(</w:t>
+        <w:t>98%</w:t>
       </w:r>
       <w:proofErr w:type="gramEnd"/>
       <w:r>
-        <w:t>47/48) for sites ≥15mm in diameter. Qualitatively, 100</w:t>
+        <w:t xml:space="preserve">(47/48) for sites ≥15mm in diameter. Qualitatively, </w:t>
       </w:r>
       <w:proofErr w:type="gramStart"/>
       <w:r>
-        <w:t>%(</w:t>
+        <w:t>100%</w:t>
       </w:r>
       <w:proofErr w:type="gramEnd"/>
       <w:r>
-        <w:t xml:space="preserve">24/24; minority vote) of the CRLM and 84%(16/19; majority vote) of the ablation-zones had Likert scores ≥4. </w:t>
+        <w:t xml:space="preserve">(24/24; minority vote) of the CRLM and 84%(16/19; majority vote) of the ablation-zones had Likert scores ≥4. </w:t>
       </w:r>
     </w:p>
     <w:p>
@@ -1384,15 +1384,7 @@
       </w:ins>
       <w:ins w:id="4" w:author="Anderson, Brian" w:date="2022-03-27T17:09:00Z">
         <w:r>
-          <w:t>disease sites. We believe this is due to the disparity in class representation, being that a majority of the liver is ‘normal</w:t>
-        </w:r>
-        <w:proofErr w:type="gramStart"/>
-        <w:r>
-          <w:t>’</w:t>
-        </w:r>
-        <w:proofErr w:type="gramEnd"/>
-        <w:r>
-          <w:t xml:space="preserve"> and the model could achieve a high segmentation accuracy by segmenting everything as ‘n</w:t>
+          <w:t>disease sites. We believe this is due to the disparity in class representation, being that a majority of the liver is ‘normal’ and the model could achieve a high segmentation accuracy by segmenting everything as ‘n</w:t>
         </w:r>
       </w:ins>
       <w:ins w:id="5" w:author="Anderson, Brian" w:date="2022-03-27T17:10:00Z">
@@ -1513,6 +1505,11 @@
       <w:r>
         <w:t xml:space="preserve">. </w:t>
       </w:r>
+      <w:ins w:id="12" w:author="Anderson, Brian [2]" w:date="2022-03-30T15:54:00Z">
+        <w:r>
+          <w:t xml:space="preserve">This ensures a representation of both disease and normal liver in each training step. </w:t>
+        </w:r>
+      </w:ins>
       <w:r>
         <w:t xml:space="preserve">Figure </w:t>
       </w:r>
@@ -1890,7 +1887,11 @@
         <w:t xml:space="preserve"> convolutions to be re-used. </w:t>
       </w:r>
       <w:r>
-        <w:t>The reuse of previous convolutions allows the number of filters to be significantly reduced</w:t>
+        <w:t xml:space="preserve">The reuse of previous </w:t>
+      </w:r>
+      <w:r>
+        <w:lastRenderedPageBreak/>
+        <w:t>convolutions allows the number of filters to be significantly reduced</w:t>
       </w:r>
       <w:r>
         <w:t>, the increase in total number of filters is re</w:t>
@@ -1910,7 +1911,6 @@
         <w:pStyle w:val="Heading3"/>
       </w:pPr>
       <w:r>
-        <w:lastRenderedPageBreak/>
         <w:t>Hybrid</w:t>
       </w:r>
       <w:r>
@@ -2050,31 +2050,31 @@
       <w:r>
         <w:t xml:space="preserve"> 121, 2) training the entire DenseNet121, 3) training only the 3D network with the extracted 2D features, and 4) entire end-to-end training. </w:t>
       </w:r>
-      <w:bookmarkStart w:id="12" w:name="_Hlk99296726"/>
+      <w:bookmarkStart w:id="13" w:name="_Hlk99296726"/>
       <w:r>
         <w:t>By breaking up the training process in this fashion, we ensured that we could use high learning rates without the risk of “untraining” pretrained layers</w:t>
       </w:r>
-      <w:ins w:id="13" w:author="Anderson, Brian" w:date="2022-03-27T18:04:00Z">
+      <w:ins w:id="14" w:author="Anderson, Brian" w:date="2022-03-27T18:04:00Z">
         <w:r>
           <w:t>, as was noticed by a marked di</w:t>
         </w:r>
       </w:ins>
-      <w:ins w:id="14" w:author="Anderson, Brian" w:date="2022-03-27T18:05:00Z">
+      <w:ins w:id="15" w:author="Anderson, Brian" w:date="2022-03-27T18:05:00Z">
         <w:r>
           <w:t>p</w:t>
         </w:r>
       </w:ins>
-      <w:ins w:id="15" w:author="Anderson, Brian" w:date="2022-03-27T18:04:00Z">
+      <w:ins w:id="16" w:author="Anderson, Brian" w:date="2022-03-27T18:04:00Z">
         <w:r>
           <w:t xml:space="preserve"> in performance in the first iterations </w:t>
         </w:r>
       </w:ins>
-      <w:ins w:id="16" w:author="Anderson, Brian" w:date="2022-03-27T18:06:00Z">
+      <w:ins w:id="17" w:author="Anderson, Brian" w:date="2022-03-27T18:06:00Z">
         <w:r>
           <w:t xml:space="preserve">of subsequent training </w:t>
         </w:r>
       </w:ins>
-      <w:ins w:id="17" w:author="Anderson, Brian" w:date="2022-03-27T18:04:00Z">
+      <w:ins w:id="18" w:author="Anderson, Brian" w:date="2022-03-27T18:04:00Z">
         <w:r>
           <w:t>if previous layers were not frozen</w:t>
         </w:r>
@@ -2082,7 +2082,7 @@
       <w:r>
         <w:t>.</w:t>
       </w:r>
-      <w:bookmarkEnd w:id="12"/>
+      <w:bookmarkEnd w:id="13"/>
       <w:r>
         <w:t xml:space="preserve"> Second, our 3D </w:t>
       </w:r>
@@ -2164,7 +2164,21 @@
         <w:t xml:space="preserve"> </w:t>
       </w:r>
       <w:r>
-        <w:t xml:space="preserve">Models were optimized using a sparse categorical cross entropy loss and Adam optimizer. Mixed precision was enabled to </w:t>
+        <w:t>Models were optimized using a sparse categorical cross entropy loss</w:t>
+      </w:r>
+      <w:ins w:id="19" w:author="Anderson, Brian [2]" w:date="2022-03-30T15:55:00Z">
+        <w:r>
+          <w:t xml:space="preserve"> (</w:t>
+        </w:r>
+        <w:r>
+          <w:t>https://www.tensorflow.org/api_docs/python/tf/keras/losses/SparseCategoricalCrossentropy</w:t>
+        </w:r>
+        <w:r>
+          <w:t>)</w:t>
+        </w:r>
+      </w:ins>
+      <w:r>
+        <w:t xml:space="preserve"> and Adam optimizer. Mixed precision was enabled to </w:t>
       </w:r>
       <w:r>
         <w:t>reduce</w:t>
@@ -2449,6 +2463,11 @@
       <w:proofErr w:type="spellEnd"/>
     </w:p>
     <w:p>
+      <w:pPr>
+        <w:rPr>
+          <w:ins w:id="20" w:author="Anderson, Brian [2]" w:date="2022-03-31T09:47:00Z"/>
+        </w:rPr>
+      </w:pPr>
       <w:r>
         <w:t xml:space="preserve">After training the 2D </w:t>
       </w:r>
@@ -2476,6 +2495,14 @@
       <w:r>
         <w:t xml:space="preserve"> 3D model. </w:t>
       </w:r>
+      <w:ins w:id="21" w:author="Anderson, Brian [2]" w:date="2022-03-31T09:46:00Z">
+        <w:r>
+          <w:t>Features extracted from the 2D network would have dimensions of 8x32x120x120x32, ‘2D Features’ Figure 3.</w:t>
+        </w:r>
+        <w:r>
+          <w:t xml:space="preserve"> </w:t>
+        </w:r>
+      </w:ins>
       <w:r>
         <w:t>A</w:t>
       </w:r>
@@ -2508,6 +2535,18 @@
       </w:r>
     </w:p>
     <w:p>
+      <w:ins w:id="22" w:author="Anderson, Brian [2]" w:date="2022-03-31T09:47:00Z">
+        <w:r>
+          <w:t xml:space="preserve">A visual </w:t>
+        </w:r>
+      </w:ins>
+      <w:ins w:id="23" w:author="Anderson, Brian [2]" w:date="2022-03-31T09:48:00Z">
+        <w:r>
+          <w:t>representation of the combined architectures can be seen in Figure 3.</w:t>
+        </w:r>
+      </w:ins>
+    </w:p>
+    <w:p>
       <w:pPr>
         <w:pStyle w:val="Heading3"/>
       </w:pPr>
@@ -2557,6 +2596,7 @@
         <w:t xml:space="preserve">based on </w:t>
       </w:r>
       <w:r>
+        <w:lastRenderedPageBreak/>
         <w:t xml:space="preserve">each </w:t>
       </w:r>
       <w:r>
@@ -2584,7 +2624,7 @@
       <w:r>
         <w:t>Gith</w:t>
       </w:r>
-      <w:ins w:id="18" w:author="Anderson, Brian" w:date="2022-03-27T17:15:00Z">
+      <w:ins w:id="24" w:author="Anderson, Brian" w:date="2022-03-27T17:15:00Z">
         <w:r>
           <w:t>u</w:t>
         </w:r>
@@ -2684,7 +2724,6 @@
         <w:t xml:space="preserve">was </w:t>
       </w:r>
       <w:r>
-        <w:lastRenderedPageBreak/>
         <w:t>used to identify tr</w:t>
       </w:r>
       <w:r>
@@ -2734,7 +2773,7 @@
       <w:r>
         <w:t>Gith</w:t>
       </w:r>
-      <w:ins w:id="19" w:author="Anderson, Brian" w:date="2022-03-27T17:15:00Z">
+      <w:ins w:id="25" w:author="Anderson, Brian" w:date="2022-03-27T17:15:00Z">
         <w:r>
           <w:t>u</w:t>
         </w:r>
@@ -2995,7 +3034,7 @@
       <w:r>
         <w:t xml:space="preserve"> </w:t>
       </w:r>
-      <w:bookmarkStart w:id="20" w:name="_Hlk99296999"/>
+      <w:bookmarkStart w:id="26" w:name="_Hlk99296999"/>
       <w:r>
         <w:t xml:space="preserve">For global </w:t>
       </w:r>
@@ -3044,12 +3083,12 @@
       <w:r>
         <w:fldChar w:fldCharType="end"/>
       </w:r>
-      <w:ins w:id="21" w:author="Anderson, Brian" w:date="2022-03-27T18:09:00Z">
+      <w:ins w:id="27" w:author="Anderson, Brian" w:date="2022-03-27T18:09:00Z">
         <w:r>
           <w:t>, otherwise DSC refers to a patient-wise evaluation</w:t>
         </w:r>
       </w:ins>
-      <w:bookmarkEnd w:id="20"/>
+      <w:bookmarkEnd w:id="26"/>
       <w:r>
         <w:t xml:space="preserve">. </w:t>
       </w:r>
@@ -3259,6 +3298,7 @@
         <w:t xml:space="preserve">2, </w:t>
       </w:r>
       <w:r>
+        <w:lastRenderedPageBreak/>
         <w:t>XXX</w:t>
       </w:r>
       <w:r>
@@ -3279,6 +3319,11 @@
       <w:r>
         <w:t xml:space="preserve">. </w:t>
       </w:r>
+      <w:ins w:id="28" w:author="Anderson, Brian [2]" w:date="2022-03-31T15:50:00Z">
+        <w:r>
+          <w:t>This will evaluate if the generated contours are deemed clinically useable.</w:t>
+        </w:r>
+      </w:ins>
     </w:p>
     <w:p>
       <w:r>
@@ -3315,117 +3360,604 @@
         <w:t>;</w:t>
       </w:r>
       <w:r>
-        <w:t xml:space="preserve"> these </w:t>
+        <w:t xml:space="preserve"> these patients had 24 C</w:t>
+      </w:r>
+      <w:r>
+        <w:t>R</w:t>
+      </w:r>
+      <w:r>
+        <w:t>LM sites and 19 ablation sites</w:t>
+      </w:r>
+      <w:r>
+        <w:t>.</w:t>
+      </w:r>
+      <w:r>
+        <w:t xml:space="preserve"> </w:t>
+      </w:r>
+      <w:r>
+        <w:t>The p</w:t>
+      </w:r>
+      <w:r>
+        <w:t>redicted C</w:t>
+      </w:r>
+      <w:r>
+        <w:t>R</w:t>
+      </w:r>
+      <w:r>
+        <w:t>LM and ablation</w:t>
+      </w:r>
+      <w:r>
+        <w:t xml:space="preserve"> contours</w:t>
+      </w:r>
+      <w:r>
+        <w:t xml:space="preserve"> </w:t>
+      </w:r>
+      <w:r>
+        <w:t xml:space="preserve">were scored independently </w:t>
+      </w:r>
+      <w:r>
+        <w:t xml:space="preserve">based on </w:t>
+      </w:r>
+      <w:r>
+        <w:t>a Likert quality scale of 1-5</w:t>
+      </w:r>
+      <w:r>
+        <w:t xml:space="preserve"> (</w:t>
+      </w:r>
+      <w:r>
+        <w:t xml:space="preserve">Supplementary </w:t>
+      </w:r>
+      <w:r>
+        <w:t xml:space="preserve">Table </w:t>
+      </w:r>
+      <w:r>
+        <w:t>1</w:t>
+      </w:r>
+      <w:r>
+        <w:t>)</w:t>
+      </w:r>
+      <w:r>
+        <w:t>.</w:t>
+      </w:r>
+    </w:p>
+    <w:p>
+      <w:pPr>
+        <w:pStyle w:val="Heading1"/>
+      </w:pPr>
+      <w:r>
+        <w:t>Results</w:t>
+      </w:r>
+    </w:p>
+    <w:p>
+      <w:r>
+        <w:t>The best validation loss score</w:t>
+      </w:r>
+      <w:r>
+        <w:t>s</w:t>
+      </w:r>
+      <w:r>
+        <w:t xml:space="preserve"> </w:t>
+      </w:r>
+      <w:r>
+        <w:t>were</w:t>
+      </w:r>
+      <w:r>
+        <w:t xml:space="preserve">, Standard </w:t>
+      </w:r>
+      <w:proofErr w:type="spellStart"/>
+      <w:r>
+        <w:t>UNet</w:t>
+      </w:r>
+      <w:proofErr w:type="spellEnd"/>
+      <w:r>
+        <w:t xml:space="preserve">: 0.041, Residual </w:t>
+      </w:r>
+      <w:proofErr w:type="spellStart"/>
+      <w:r>
+        <w:t>UNet</w:t>
+      </w:r>
+      <w:proofErr w:type="spellEnd"/>
+      <w:r>
+        <w:t xml:space="preserve">: 0.024, </w:t>
+      </w:r>
+      <w:proofErr w:type="spellStart"/>
+      <w:r>
+        <w:t>DenseUNet</w:t>
+      </w:r>
+      <w:proofErr w:type="spellEnd"/>
+      <w:r>
+        <w:t>: 0.016, DenseNet2D (Encoder frozen): 0.022, DenseNet2D (All trainable): 0.013, DenseNet3D (2D frozen): 0.011, DenseNet3D (All trainable): 0.0092.</w:t>
+      </w:r>
+      <w:bookmarkStart w:id="29" w:name="_GoBack"/>
+      <w:bookmarkEnd w:id="29"/>
+    </w:p>
+    <w:p>
+      <w:pPr>
+        <w:pStyle w:val="Heading2"/>
+      </w:pPr>
+      <w:r>
+        <w:t>Quantitative</w:t>
+      </w:r>
+    </w:p>
+    <w:p>
+      <w:r>
+        <w:t>The best model</w:t>
+      </w:r>
+      <w:r>
+        <w:t xml:space="preserve"> </w:t>
+      </w:r>
+      <w:r>
+        <w:t xml:space="preserve">was </w:t>
+      </w:r>
+      <w:r>
+        <w:t>the</w:t>
+      </w:r>
+      <w:r>
+        <w:t xml:space="preserve"> </w:t>
+      </w:r>
+      <w:r>
+        <w:t>H</w:t>
+      </w:r>
+      <w:r>
+        <w:t>ybrid-</w:t>
+      </w:r>
+      <w:proofErr w:type="spellStart"/>
+      <w:r>
+        <w:t>W</w:t>
+      </w:r>
+      <w:r>
+        <w:t>Net</w:t>
+      </w:r>
+      <w:proofErr w:type="spellEnd"/>
+      <w:r>
+        <w:t xml:space="preserve"> model</w:t>
+      </w:r>
+      <w:r>
+        <w:t>:</w:t>
+      </w:r>
+      <w:r>
+        <w:t xml:space="preserve"> </w:t>
+      </w:r>
+      <w:r>
+        <w:t>the 3D-</w:t>
+      </w:r>
+      <w:r>
+        <w:t>UNet contain</w:t>
+      </w:r>
+      <w:r>
+        <w:t>ed</w:t>
+      </w:r>
+      <w:r>
+        <w:t xml:space="preserve"> two layers, two convolution blocks, and </w:t>
+      </w:r>
+      <w:r>
+        <w:t xml:space="preserve">32 </w:t>
+      </w:r>
+      <w:r>
+        <w:t>filters</w:t>
+      </w:r>
+      <w:r>
+        <w:t xml:space="preserve"> and had a convolution lambda of two</w:t>
+      </w:r>
+      <w:r>
+        <w:t>. The model consist</w:t>
+      </w:r>
+      <w:r>
+        <w:t>ed</w:t>
+      </w:r>
+      <w:r>
+        <w:t xml:space="preserve"> of </w:t>
+      </w:r>
+      <w:r>
+        <w:t>14,497,600</w:t>
+      </w:r>
+      <w:r>
+        <w:t xml:space="preserve"> </w:t>
+      </w:r>
+      <w:r>
+        <w:t>parameters</w:t>
+      </w:r>
+      <w:r>
+        <w:t xml:space="preserve"> (</w:t>
+      </w:r>
+      <w:r>
+        <w:t>14,408,960</w:t>
+      </w:r>
+      <w:r>
+        <w:t xml:space="preserve"> trainable</w:t>
+      </w:r>
+      <w:r>
+        <w:t xml:space="preserve"> and</w:t>
+      </w:r>
+      <w:r>
+        <w:t xml:space="preserve"> </w:t>
+      </w:r>
+      <w:r>
+        <w:t>88,640</w:t>
+      </w:r>
+      <w:r>
+        <w:t xml:space="preserve"> </w:t>
+      </w:r>
+      <w:r>
+        <w:t>non-trainable)</w:t>
+      </w:r>
+      <w:r>
+        <w:t xml:space="preserve">. </w:t>
+      </w:r>
+    </w:p>
+    <w:p>
+      <w:r>
+        <w:t>A</w:t>
+      </w:r>
+      <w:r>
+        <w:t xml:space="preserve"> seed</w:t>
+      </w:r>
+      <w:r>
+        <w:t xml:space="preserve"> </w:t>
+      </w:r>
+      <w:r>
+        <w:t xml:space="preserve">value of </w:t>
+      </w:r>
+      <w:r>
+        <w:t>0.6</w:t>
+      </w:r>
+      <w:r>
+        <w:t>7</w:t>
+      </w:r>
+      <w:r>
+        <w:t xml:space="preserve"> </w:t>
+      </w:r>
+      <w:r>
+        <w:t xml:space="preserve">and threshold value of </w:t>
+      </w:r>
+      <w:r>
+        <w:t>0.</w:t>
+      </w:r>
+      <w:r>
+        <w:t>30</w:t>
+      </w:r>
+      <w:r>
+        <w:t xml:space="preserve"> </w:t>
+      </w:r>
+      <w:r>
+        <w:t>resulted in the highest overall</w:t>
+      </w:r>
+      <w:r>
+        <w:t xml:space="preserve"> DSC in the validation dataset.</w:t>
+      </w:r>
+      <w:r>
+        <w:t xml:space="preserve"> </w:t>
+      </w:r>
+      <w:proofErr w:type="spellStart"/>
+      <w:r>
+        <w:t>LiTs</w:t>
+      </w:r>
+      <w:proofErr w:type="spellEnd"/>
+      <w:r>
+        <w:t xml:space="preserve"> test set (n=</w:t>
+      </w:r>
+      <w:r>
+        <w:t>70</w:t>
+      </w:r>
+      <w:r>
+        <w:t>)</w:t>
+      </w:r>
+      <w:r>
+        <w:t xml:space="preserve"> predictions required</w:t>
+      </w:r>
+      <w:r>
+        <w:t xml:space="preserve"> a mean of 9.58 seconds, with a standard deviation of 2.32 seconds.</w:t>
+      </w:r>
+    </w:p>
+    <w:p>
+      <w:pPr>
+        <w:pStyle w:val="Heading3"/>
+      </w:pPr>
+      <w:r>
+        <w:t>Site-by-Site evaluation</w:t>
+      </w:r>
+    </w:p>
+    <w:p>
+      <w:pPr>
+        <w:pStyle w:val="Heading4"/>
+      </w:pPr>
+      <w:r>
+        <w:t>3D-IRCADb</w:t>
+      </w:r>
+    </w:p>
+    <w:p>
+      <w:r>
+        <w:t xml:space="preserve">On a site-by-site basis, </w:t>
+      </w:r>
+      <w:r>
+        <w:t xml:space="preserve">the median surface distance, DSC, and sensitivity are presented in Table 3. Sites are distributed into two groups based on diameter: </w:t>
+      </w:r>
+      <w:r>
+        <w:t xml:space="preserve">sites </w:t>
+      </w:r>
+      <w:r>
+        <w:t>&lt;</w:t>
+      </w:r>
+      <w:r>
+        <w:t xml:space="preserve"> </w:t>
+      </w:r>
+      <w:r>
+        <w:t>1</w:t>
+      </w:r>
+      <w:r>
+        <w:t>5</w:t>
+      </w:r>
+      <w:r>
+        <w:t xml:space="preserve"> </w:t>
+      </w:r>
+      <w:r>
+        <w:t>mm</w:t>
+      </w:r>
+      <w:r>
+        <w:t xml:space="preserve"> and </w:t>
+      </w:r>
+      <w:r>
+        <w:rPr>
+          <w:rFonts w:cstheme="minorHAnsi"/>
+        </w:rPr>
+        <w:t>≥</w:t>
+      </w:r>
+      <w:r>
+        <w:t xml:space="preserve"> </w:t>
+      </w:r>
+      <w:r>
+        <w:t>15</w:t>
+      </w:r>
+      <w:r>
+        <w:t xml:space="preserve"> </w:t>
+      </w:r>
+      <w:r>
+        <w:t>mm</w:t>
+      </w:r>
+      <w:r>
+        <w:t>.</w:t>
+      </w:r>
+      <w:r>
+        <w:t xml:space="preserve"> For sites </w:t>
+      </w:r>
+      <w:r>
+        <w:rPr>
+          <w:rFonts w:cstheme="minorHAnsi"/>
+        </w:rPr>
+        <w:t>≥</w:t>
+      </w:r>
+      <w:r>
+        <w:t xml:space="preserve"> 15 mm (n=48), mean DSC was 0.74 and sensitivity was 98%. For sites &lt; 15 mm (n=73), mean DSC was 0.16 and sensitivity was 23%.</w:t>
+      </w:r>
+    </w:p>
+    <w:p>
+      <w:pPr>
+        <w:pStyle w:val="Heading4"/>
+      </w:pPr>
+      <w:r>
+        <w:t>Institutional Data</w:t>
+      </w:r>
+    </w:p>
+    <w:p>
+      <w:r>
+        <w:t xml:space="preserve">For the pre-treatment CECT </w:t>
+      </w:r>
+      <w:r>
+        <w:t>CRLM target disease</w:t>
+      </w:r>
+      <w:r>
+        <w:t xml:space="preserve"> (n=19 sites), </w:t>
+      </w:r>
+      <w:r>
+        <w:t>the mean (min-max) DSC was 0.80</w:t>
+      </w:r>
+      <w:r>
+        <w:t xml:space="preserve"> </w:t>
+      </w:r>
+      <w:r>
+        <w:t>(0.59-0.91), with 84%</w:t>
+      </w:r>
+      <w:r>
+        <w:t xml:space="preserve"> </w:t>
+      </w:r>
+      <w:r>
+        <w:t>(16/19)</w:t>
+      </w:r>
+      <w:r>
+        <w:t xml:space="preserve"> having DSC</w:t>
+      </w:r>
+      <w:r>
+        <w:t xml:space="preserve"> </w:t>
+      </w:r>
+      <w:r>
+        <w:rPr>
+          <w:rFonts w:cstheme="minorHAnsi"/>
+        </w:rPr>
+        <w:t>≥</w:t>
+      </w:r>
+      <w:r>
+        <w:rPr>
+          <w:rFonts w:cstheme="minorHAnsi"/>
+        </w:rPr>
+        <w:t xml:space="preserve"> </w:t>
+      </w:r>
+      <w:r>
+        <w:t xml:space="preserve">0.76. For the post-treatment CECT </w:t>
+      </w:r>
+      <w:r>
+        <w:t xml:space="preserve">target ablation zones </w:t>
+      </w:r>
+      <w:r>
+        <w:t xml:space="preserve">(n=14 sites), </w:t>
+      </w:r>
+      <w:r>
+        <w:t>the mean (min-max) DSC was 0.75</w:t>
+      </w:r>
+      <w:r>
+        <w:t xml:space="preserve"> </w:t>
+      </w:r>
+      <w:r>
+        <w:t>(0.09-0.90), with 71%</w:t>
+      </w:r>
+      <w:r>
+        <w:t xml:space="preserve"> </w:t>
+      </w:r>
+      <w:r>
+        <w:t>(10/14) having DSC</w:t>
+      </w:r>
+      <w:r>
+        <w:t xml:space="preserve"> </w:t>
+      </w:r>
+      <w:r>
+        <w:rPr>
+          <w:rFonts w:cstheme="minorHAnsi"/>
+        </w:rPr>
+        <w:t>≥</w:t>
+      </w:r>
+      <w:r>
+        <w:rPr>
+          <w:rFonts w:cstheme="minorHAnsi"/>
+        </w:rPr>
+        <w:t xml:space="preserve"> </w:t>
+      </w:r>
+      <w:r>
+        <w:t>0.76.</w:t>
+      </w:r>
+    </w:p>
+    <w:p>
+      <w:pPr>
+        <w:pStyle w:val="Heading3"/>
+      </w:pPr>
+      <w:r>
+        <w:t>Patient-by-Patient evaluation</w:t>
+      </w:r>
+    </w:p>
+    <w:p>
+      <w:r>
+        <w:t xml:space="preserve">Patient-by-patient evaluation for 3D-IRCADb and institutional data are summarized in Table </w:t>
+      </w:r>
+      <w:r>
+        <w:t>4</w:t>
+      </w:r>
+      <w:r>
+        <w:t>.</w:t>
+      </w:r>
+    </w:p>
+    <w:p>
+      <w:pPr>
+        <w:pStyle w:val="Heading4"/>
+      </w:pPr>
+      <w:r>
+        <w:t>3D-IRCADb</w:t>
+      </w:r>
+    </w:p>
+    <w:p>
+      <w:r>
+        <w:t>Quantitative metrics o</w:t>
+      </w:r>
+      <w:r>
+        <w:t>n a patient</w:t>
+      </w:r>
+      <w:r>
+        <w:t>-by-patient basis</w:t>
+      </w:r>
+      <w:r>
+        <w:t xml:space="preserve"> for 3D-IRCADb are summarized in the top of Table </w:t>
+      </w:r>
+      <w:r>
+        <w:t>4</w:t>
+      </w:r>
+      <w:r>
+        <w:t xml:space="preserve">. Median DSC was 0.74, median surface distance was 1.95 mm, and median false-positive discoveries per patient was 1. </w:t>
+      </w:r>
+      <w:r>
+        <w:t>Note that a single patient might have multipl</w:t>
+      </w:r>
+      <w:r>
+        <w:t>e</w:t>
+      </w:r>
+      <w:r>
+        <w:t xml:space="preserve"> disease sites of varying size</w:t>
+      </w:r>
+      <w:r>
+        <w:t>s</w:t>
+      </w:r>
+      <w:r>
+        <w:t>.</w:t>
+      </w:r>
+      <w:r>
+        <w:t xml:space="preserve"> </w:t>
+      </w:r>
+      <w:r>
+        <w:t>The global DSC score was 0.81.</w:t>
+      </w:r>
+    </w:p>
+    <w:p>
+      <w:pPr>
+        <w:pStyle w:val="Heading4"/>
+      </w:pPr>
+      <w:r>
+        <w:t>Institutional D</w:t>
+      </w:r>
+      <w:r>
+        <w:t>ata</w:t>
+      </w:r>
+    </w:p>
+    <w:p>
+      <w:r>
+        <w:t xml:space="preserve">Quantitative metrics for the institutional data are summarized in </w:t>
+      </w:r>
+      <w:r>
+        <w:t>the middle and bottom of Table 4</w:t>
+      </w:r>
+      <w:r>
+        <w:t xml:space="preserve">. </w:t>
+      </w:r>
+      <w:r>
+        <w:t>For the pre-treatment CECT</w:t>
+      </w:r>
+      <w:r>
+        <w:t xml:space="preserve"> CRLM target disease</w:t>
+      </w:r>
+      <w:r>
+        <w:t xml:space="preserve"> (n=</w:t>
+      </w:r>
+      <w:r>
+        <w:t>15 patients</w:t>
+      </w:r>
+      <w:r>
+        <w:t xml:space="preserve">), the </w:t>
+      </w:r>
+      <w:r>
+        <w:t>median</w:t>
+      </w:r>
+      <w:r>
+        <w:t xml:space="preserve"> DSC</w:t>
+      </w:r>
+      <w:r>
+        <w:t xml:space="preserve"> </w:t>
+      </w:r>
+      <w:r>
+        <w:t xml:space="preserve">was </w:t>
+      </w:r>
+      <w:r>
+        <w:t>0.78, median surface distance was 0.78 mm, and false-positive discoveries per patient was 1</w:t>
+      </w:r>
+      <w:r>
+        <w:t xml:space="preserve">. </w:t>
+      </w:r>
+      <w:r>
+        <w:t xml:space="preserve">For the post-treatment CECT </w:t>
       </w:r>
       <w:r>
         <w:lastRenderedPageBreak/>
-        <w:t>patients had 24 C</w:t>
-      </w:r>
-      <w:r>
-        <w:t>R</w:t>
-      </w:r>
-      <w:r>
-        <w:t>LM sites and 19 ablation sites</w:t>
-      </w:r>
-      <w:r>
-        <w:t>.</w:t>
-      </w:r>
-      <w:r>
-        <w:t xml:space="preserve"> </w:t>
-      </w:r>
-      <w:r>
-        <w:t>The p</w:t>
-      </w:r>
-      <w:r>
-        <w:t>redicted C</w:t>
-      </w:r>
-      <w:r>
-        <w:t>R</w:t>
-      </w:r>
-      <w:r>
-        <w:t>LM and ablation</w:t>
-      </w:r>
-      <w:r>
-        <w:t xml:space="preserve"> contours</w:t>
-      </w:r>
-      <w:r>
-        <w:t xml:space="preserve"> </w:t>
-      </w:r>
-      <w:r>
-        <w:t xml:space="preserve">were scored independently </w:t>
-      </w:r>
-      <w:r>
-        <w:t xml:space="preserve">based on </w:t>
-      </w:r>
-      <w:r>
-        <w:t>a Likert quality scale of 1-5</w:t>
-      </w:r>
-      <w:r>
-        <w:t xml:space="preserve"> (</w:t>
-      </w:r>
-      <w:r>
-        <w:t xml:space="preserve">Supplementary </w:t>
-      </w:r>
-      <w:r>
-        <w:t xml:space="preserve">Table </w:t>
-      </w:r>
-      <w:r>
-        <w:t>1</w:t>
-      </w:r>
-      <w:r>
-        <w:t>)</w:t>
-      </w:r>
-      <w:r>
-        <w:t>.</w:t>
-      </w:r>
-    </w:p>
-    <w:p>
-      <w:pPr>
-        <w:pStyle w:val="Heading1"/>
-      </w:pPr>
-      <w:r>
-        <w:t>Results</w:t>
-      </w:r>
-    </w:p>
-    <w:p>
-      <w:r>
-        <w:t>The best validation loss score</w:t>
-      </w:r>
-      <w:r>
-        <w:t>s</w:t>
-      </w:r>
-      <w:r>
-        <w:t xml:space="preserve"> </w:t>
-      </w:r>
-      <w:r>
-        <w:t>were</w:t>
-      </w:r>
-      <w:r>
-        <w:t xml:space="preserve">, Standard </w:t>
-      </w:r>
-      <w:proofErr w:type="spellStart"/>
-      <w:r>
-        <w:t>UNet</w:t>
-      </w:r>
-      <w:proofErr w:type="spellEnd"/>
-      <w:r>
-        <w:t xml:space="preserve">: 0.041, Residual </w:t>
-      </w:r>
-      <w:proofErr w:type="spellStart"/>
-      <w:r>
-        <w:t>UNet</w:t>
-      </w:r>
-      <w:proofErr w:type="spellEnd"/>
-      <w:r>
-        <w:t xml:space="preserve">: 0.024, </w:t>
-      </w:r>
-      <w:proofErr w:type="spellStart"/>
-      <w:r>
-        <w:t>DenseUNet</w:t>
-      </w:r>
-      <w:proofErr w:type="spellEnd"/>
-      <w:r>
-        <w:t>: 0.016, DenseNet2D (Encoder frozen): 0.022, DenseNet2D (All trainable): 0.013, DenseNet3D (2D frozen): 0.011, DenseNet3D (All trainable): 0.0092.</w:t>
+        <w:t xml:space="preserve">target ablation zones </w:t>
+      </w:r>
+      <w:r>
+        <w:t xml:space="preserve">(n=9 patients), </w:t>
+      </w:r>
+      <w:r>
+        <w:t xml:space="preserve">the median DSC was 0.79, median surface distance was 0.76 mm, and false-positive discoveries per patient was 2. </w:t>
       </w:r>
     </w:p>
     <w:p>
@@ -3433,492 +3965,6 @@
         <w:pStyle w:val="Heading2"/>
       </w:pPr>
       <w:r>
-        <w:t>Quantitative</w:t>
-      </w:r>
-    </w:p>
-    <w:p>
-      <w:r>
-        <w:t>The best model</w:t>
-      </w:r>
-      <w:r>
-        <w:t xml:space="preserve"> </w:t>
-      </w:r>
-      <w:r>
-        <w:t xml:space="preserve">was </w:t>
-      </w:r>
-      <w:r>
-        <w:t>the</w:t>
-      </w:r>
-      <w:r>
-        <w:t xml:space="preserve"> </w:t>
-      </w:r>
-      <w:r>
-        <w:t>H</w:t>
-      </w:r>
-      <w:r>
-        <w:t>ybrid-</w:t>
-      </w:r>
-      <w:proofErr w:type="spellStart"/>
-      <w:r>
-        <w:t>W</w:t>
-      </w:r>
-      <w:r>
-        <w:t>Net</w:t>
-      </w:r>
-      <w:proofErr w:type="spellEnd"/>
-      <w:r>
-        <w:t xml:space="preserve"> model</w:t>
-      </w:r>
-      <w:r>
-        <w:t>:</w:t>
-      </w:r>
-      <w:r>
-        <w:t xml:space="preserve"> </w:t>
-      </w:r>
-      <w:r>
-        <w:t>the 3D-</w:t>
-      </w:r>
-      <w:r>
-        <w:t>UNet contain</w:t>
-      </w:r>
-      <w:r>
-        <w:t>ed</w:t>
-      </w:r>
-      <w:r>
-        <w:t xml:space="preserve"> two layers, two convolution blocks, and </w:t>
-      </w:r>
-      <w:r>
-        <w:t xml:space="preserve">32 </w:t>
-      </w:r>
-      <w:r>
-        <w:t>filters</w:t>
-      </w:r>
-      <w:r>
-        <w:t xml:space="preserve"> and had a convolution lambda of two</w:t>
-      </w:r>
-      <w:r>
-        <w:t>. The model consist</w:t>
-      </w:r>
-      <w:r>
-        <w:t>ed</w:t>
-      </w:r>
-      <w:r>
-        <w:t xml:space="preserve"> of </w:t>
-      </w:r>
-      <w:r>
-        <w:t>14,497,600</w:t>
-      </w:r>
-      <w:r>
-        <w:t xml:space="preserve"> </w:t>
-      </w:r>
-      <w:r>
-        <w:t>parameters</w:t>
-      </w:r>
-      <w:r>
-        <w:t xml:space="preserve"> (</w:t>
-      </w:r>
-      <w:r>
-        <w:t>14,408,960</w:t>
-      </w:r>
-      <w:r>
-        <w:t xml:space="preserve"> trainable</w:t>
-      </w:r>
-      <w:r>
-        <w:t xml:space="preserve"> and</w:t>
-      </w:r>
-      <w:r>
-        <w:t xml:space="preserve"> </w:t>
-      </w:r>
-      <w:r>
-        <w:t>88,640</w:t>
-      </w:r>
-      <w:r>
-        <w:t xml:space="preserve"> </w:t>
-      </w:r>
-      <w:r>
-        <w:t>non-trainable)</w:t>
-      </w:r>
-      <w:r>
-        <w:t xml:space="preserve">. </w:t>
-      </w:r>
-    </w:p>
-    <w:p>
-      <w:r>
-        <w:t>A</w:t>
-      </w:r>
-      <w:r>
-        <w:t xml:space="preserve"> seed</w:t>
-      </w:r>
-      <w:r>
-        <w:t xml:space="preserve"> </w:t>
-      </w:r>
-      <w:r>
-        <w:t xml:space="preserve">value of </w:t>
-      </w:r>
-      <w:r>
-        <w:t>0.6</w:t>
-      </w:r>
-      <w:r>
-        <w:t>7</w:t>
-      </w:r>
-      <w:r>
-        <w:t xml:space="preserve"> </w:t>
-      </w:r>
-      <w:r>
-        <w:t xml:space="preserve">and threshold value of </w:t>
-      </w:r>
-      <w:r>
-        <w:t>0.</w:t>
-      </w:r>
-      <w:r>
-        <w:t>30</w:t>
-      </w:r>
-      <w:r>
-        <w:t xml:space="preserve"> </w:t>
-      </w:r>
-      <w:r>
-        <w:t>resulted in the highest overall</w:t>
-      </w:r>
-      <w:r>
-        <w:t xml:space="preserve"> DSC in the validation dataset.</w:t>
-      </w:r>
-      <w:r>
-        <w:t xml:space="preserve"> </w:t>
-      </w:r>
-      <w:proofErr w:type="spellStart"/>
-      <w:r>
-        <w:t>LiTs</w:t>
-      </w:r>
-      <w:proofErr w:type="spellEnd"/>
-      <w:r>
-        <w:t xml:space="preserve"> test set (n=</w:t>
-      </w:r>
-      <w:r>
-        <w:t>70</w:t>
-      </w:r>
-      <w:r>
-        <w:t>)</w:t>
-      </w:r>
-      <w:r>
-        <w:t xml:space="preserve"> predictions required</w:t>
-      </w:r>
-      <w:r>
-        <w:t xml:space="preserve"> a mean of 9.58 seconds, with a standard deviation of 2.32 seconds.</w:t>
-      </w:r>
-    </w:p>
-    <w:p>
-      <w:pPr>
-        <w:pStyle w:val="Heading3"/>
-      </w:pPr>
-      <w:r>
-        <w:t>Site-by-Site evaluation</w:t>
-      </w:r>
-    </w:p>
-    <w:p>
-      <w:pPr>
-        <w:pStyle w:val="Heading4"/>
-      </w:pPr>
-      <w:r>
-        <w:t>3D-IRCADb</w:t>
-      </w:r>
-    </w:p>
-    <w:p>
-      <w:r>
-        <w:t xml:space="preserve">On a site-by-site basis, </w:t>
-      </w:r>
-      <w:r>
-        <w:t xml:space="preserve">the median surface distance, DSC, and sensitivity are presented in Table 3. Sites are distributed into two groups based on diameter: </w:t>
-      </w:r>
-      <w:r>
-        <w:t xml:space="preserve">sites </w:t>
-      </w:r>
-      <w:r>
-        <w:t>&lt;</w:t>
-      </w:r>
-      <w:r>
-        <w:t xml:space="preserve"> </w:t>
-      </w:r>
-      <w:r>
-        <w:t>1</w:t>
-      </w:r>
-      <w:r>
-        <w:t>5</w:t>
-      </w:r>
-      <w:r>
-        <w:t xml:space="preserve"> </w:t>
-      </w:r>
-      <w:r>
-        <w:t>mm</w:t>
-      </w:r>
-      <w:r>
-        <w:t xml:space="preserve"> and </w:t>
-      </w:r>
-      <w:r>
-        <w:rPr>
-          <w:rFonts w:cstheme="minorHAnsi"/>
-        </w:rPr>
-        <w:t>≥</w:t>
-      </w:r>
-      <w:r>
-        <w:t xml:space="preserve"> </w:t>
-      </w:r>
-      <w:r>
-        <w:t>15</w:t>
-      </w:r>
-      <w:r>
-        <w:t xml:space="preserve"> </w:t>
-      </w:r>
-      <w:r>
-        <w:t>mm</w:t>
-      </w:r>
-      <w:r>
-        <w:t>.</w:t>
-      </w:r>
-      <w:r>
-        <w:t xml:space="preserve"> For sites </w:t>
-      </w:r>
-      <w:r>
-        <w:rPr>
-          <w:rFonts w:cstheme="minorHAnsi"/>
-        </w:rPr>
-        <w:t>≥</w:t>
-      </w:r>
-      <w:r>
-        <w:t xml:space="preserve"> 15 mm (n=48), mean DSC was 0.74 and sensitivity was 98%. For sites &lt; 15 mm (n=73), mean DSC was 0.16 and sensitivity was 23%.</w:t>
-      </w:r>
-    </w:p>
-    <w:p>
-      <w:pPr>
-        <w:pStyle w:val="Heading4"/>
-      </w:pPr>
-      <w:r>
-        <w:t>Institutional Data</w:t>
-      </w:r>
-    </w:p>
-    <w:p>
-      <w:r>
-        <w:t xml:space="preserve">For the pre-treatment CECT </w:t>
-      </w:r>
-      <w:r>
-        <w:t>CRLM target disease</w:t>
-      </w:r>
-      <w:r>
-        <w:t xml:space="preserve"> (n=19 sites), </w:t>
-      </w:r>
-      <w:r>
-        <w:t>the mean (min-max) DSC was 0.80</w:t>
-      </w:r>
-      <w:r>
-        <w:t xml:space="preserve"> </w:t>
-      </w:r>
-      <w:r>
-        <w:t>(0.59-0.91), with 84%</w:t>
-      </w:r>
-      <w:r>
-        <w:t xml:space="preserve"> </w:t>
-      </w:r>
-      <w:r>
-        <w:t>(16/19)</w:t>
-      </w:r>
-      <w:r>
-        <w:t xml:space="preserve"> having DSC</w:t>
-      </w:r>
-      <w:r>
-        <w:t xml:space="preserve"> </w:t>
-      </w:r>
-      <w:r>
-        <w:rPr>
-          <w:rFonts w:cstheme="minorHAnsi"/>
-        </w:rPr>
-        <w:t>≥</w:t>
-      </w:r>
-      <w:r>
-        <w:rPr>
-          <w:rFonts w:cstheme="minorHAnsi"/>
-        </w:rPr>
-        <w:t xml:space="preserve"> </w:t>
-      </w:r>
-      <w:r>
-        <w:t xml:space="preserve">0.76. For the post-treatment CECT </w:t>
-      </w:r>
-      <w:r>
-        <w:t xml:space="preserve">target ablation zones </w:t>
-      </w:r>
-      <w:r>
-        <w:t xml:space="preserve">(n=14 sites), </w:t>
-      </w:r>
-      <w:r>
-        <w:t>the mean (min-max) DSC was 0.75</w:t>
-      </w:r>
-      <w:r>
-        <w:t xml:space="preserve"> </w:t>
-      </w:r>
-      <w:r>
-        <w:t>(0.09-0.90), with 71%</w:t>
-      </w:r>
-      <w:r>
-        <w:t xml:space="preserve"> </w:t>
-      </w:r>
-      <w:r>
-        <w:t>(10/14) having DSC</w:t>
-      </w:r>
-      <w:r>
-        <w:t xml:space="preserve"> </w:t>
-      </w:r>
-      <w:r>
-        <w:rPr>
-          <w:rFonts w:cstheme="minorHAnsi"/>
-        </w:rPr>
-        <w:t>≥</w:t>
-      </w:r>
-      <w:r>
-        <w:rPr>
-          <w:rFonts w:cstheme="minorHAnsi"/>
-        </w:rPr>
-        <w:t xml:space="preserve"> </w:t>
-      </w:r>
-      <w:r>
-        <w:t>0.76.</w:t>
-      </w:r>
-    </w:p>
-    <w:p>
-      <w:pPr>
-        <w:pStyle w:val="Heading3"/>
-      </w:pPr>
-      <w:r>
-        <w:t>Patient-by-Patient evaluation</w:t>
-      </w:r>
-    </w:p>
-    <w:p>
-      <w:r>
-        <w:t xml:space="preserve">Patient-by-patient evaluation for 3D-IRCADb and institutional data are summarized in Table </w:t>
-      </w:r>
-      <w:r>
-        <w:t>4</w:t>
-      </w:r>
-      <w:r>
-        <w:t>.</w:t>
-      </w:r>
-    </w:p>
-    <w:p>
-      <w:pPr>
-        <w:pStyle w:val="Heading4"/>
-      </w:pPr>
-      <w:r>
-        <w:t>3D-IRCADb</w:t>
-      </w:r>
-    </w:p>
-    <w:p>
-      <w:r>
-        <w:t>Quantitative metrics o</w:t>
-      </w:r>
-      <w:r>
-        <w:t>n a patient</w:t>
-      </w:r>
-      <w:r>
-        <w:t>-by-patient basis</w:t>
-      </w:r>
-      <w:r>
-        <w:t xml:space="preserve"> for 3D-IRCADb are summarized in the top of Table </w:t>
-      </w:r>
-      <w:r>
-        <w:t>4</w:t>
-      </w:r>
-      <w:r>
-        <w:t xml:space="preserve">. Median DSC was 0.74, median surface distance was 1.95 mm, and median false-positive discoveries per patient was 1. </w:t>
-      </w:r>
-      <w:r>
-        <w:t>Note that a single patient might have multipl</w:t>
-      </w:r>
-      <w:r>
-        <w:t>e</w:t>
-      </w:r>
-      <w:r>
-        <w:t xml:space="preserve"> disease sites of varying size</w:t>
-      </w:r>
-      <w:r>
-        <w:t>s</w:t>
-      </w:r>
-      <w:r>
-        <w:t>.</w:t>
-      </w:r>
-      <w:r>
-        <w:t xml:space="preserve"> </w:t>
-      </w:r>
-      <w:r>
-        <w:t>The global DSC score was 0.81.</w:t>
-      </w:r>
-    </w:p>
-    <w:p>
-      <w:pPr>
-        <w:pStyle w:val="Heading4"/>
-      </w:pPr>
-      <w:r>
-        <w:t>Institutional D</w:t>
-      </w:r>
-      <w:r>
-        <w:t>ata</w:t>
-      </w:r>
-    </w:p>
-    <w:p>
-      <w:r>
-        <w:t xml:space="preserve">Quantitative metrics for the institutional data are summarized in </w:t>
-      </w:r>
-      <w:r>
-        <w:t>the middle and bottom of Table 4</w:t>
-      </w:r>
-      <w:r>
-        <w:t xml:space="preserve">. </w:t>
-      </w:r>
-      <w:r>
-        <w:t>For the pre-treatment CECT</w:t>
-      </w:r>
-      <w:r>
-        <w:t xml:space="preserve"> CRLM target disease</w:t>
-      </w:r>
-      <w:r>
-        <w:t xml:space="preserve"> (n=</w:t>
-      </w:r>
-      <w:r>
-        <w:t>15 patients</w:t>
-      </w:r>
-      <w:r>
-        <w:t xml:space="preserve">), the </w:t>
-      </w:r>
-      <w:r>
-        <w:t>median</w:t>
-      </w:r>
-      <w:r>
-        <w:t xml:space="preserve"> DSC</w:t>
-      </w:r>
-      <w:r>
-        <w:t xml:space="preserve"> </w:t>
-      </w:r>
-      <w:r>
-        <w:t xml:space="preserve">was </w:t>
-      </w:r>
-      <w:r>
-        <w:t>0.78, median surface distance was 0.78 mm, and false-positive discoveries per patient was 1</w:t>
-      </w:r>
-      <w:r>
-        <w:t xml:space="preserve">. </w:t>
-      </w:r>
-      <w:r>
-        <w:t xml:space="preserve">For the post-treatment CECT target ablation zones </w:t>
-      </w:r>
-      <w:r>
-        <w:t xml:space="preserve">(n=9 patients), </w:t>
-      </w:r>
-      <w:r>
-        <w:t xml:space="preserve">the median DSC was 0.79, median surface distance was 0.76 mm, and false-positive discoveries per patient was 2. </w:t>
-      </w:r>
-    </w:p>
-    <w:p>
-      <w:pPr>
-        <w:pStyle w:val="Heading2"/>
-      </w:pPr>
-      <w:r>
-        <w:lastRenderedPageBreak/>
         <w:t>Qualitative</w:t>
       </w:r>
       <w:r>
@@ -7358,23 +7404,23 @@
           <w:sz w:val="16"/>
           <w:szCs w:val="16"/>
         </w:rPr>
-        <w:t xml:space="preserve">, where final features </w:t>
-      </w:r>
-      <w:r>
-        <w:rPr>
-          <w:rFonts w:ascii="Arial" w:hAnsi="Arial" w:cs="Arial"/>
-          <w:sz w:val="16"/>
-          <w:szCs w:val="16"/>
-        </w:rPr>
-        <w:t>were</w:t>
-      </w:r>
-      <w:r>
-        <w:rPr>
-          <w:rFonts w:ascii="Arial" w:hAnsi="Arial" w:cs="Arial"/>
-          <w:sz w:val="16"/>
-          <w:szCs w:val="16"/>
-        </w:rPr>
-        <w:t xml:space="preserve"> concatenated into 3D </w:t>
+        <w:t>, where final features</w:t>
+      </w:r>
+      <w:r>
+        <w:rPr>
+          <w:rFonts w:ascii="Arial" w:hAnsi="Arial" w:cs="Arial"/>
+          <w:sz w:val="16"/>
+          <w:szCs w:val="16"/>
+        </w:rPr>
+        <w:t xml:space="preserve">, filters from 2D prediction are 32 and </w:t>
+      </w:r>
+      <w:r>
+        <w:rPr>
+          <w:rFonts w:ascii="Arial" w:hAnsi="Arial" w:cs="Arial"/>
+          <w:sz w:val="16"/>
+          <w:szCs w:val="16"/>
+        </w:rPr>
+        <w:t xml:space="preserve">concatenated into 3D </w:t>
       </w:r>
       <w:proofErr w:type="spellStart"/>
       <w:r>
@@ -7426,15 +7472,31 @@
           <w:sz w:val="16"/>
           <w:szCs w:val="16"/>
         </w:rPr>
-        <w:t>defined as two layers, two convolution blocks in layer 0, three convolution blocks in layer 1, and eight initial filters.</w:t>
-      </w:r>
-      <w:r>
-        <w:rPr>
-          <w:rFonts w:ascii="Arial" w:hAnsi="Arial" w:cs="Arial"/>
-          <w:sz w:val="16"/>
-          <w:szCs w:val="16"/>
-        </w:rPr>
-        <w:t xml:space="preserve"> BN: Batch Normalization</w:t>
+        <w:t xml:space="preserve">defined as two layers, two convolution blocks in layer 0, three convolution blocks in layer 1, and </w:t>
+      </w:r>
+      <w:r>
+        <w:rPr>
+          <w:rFonts w:ascii="Arial" w:hAnsi="Arial" w:cs="Arial"/>
+          <w:sz w:val="16"/>
+          <w:szCs w:val="16"/>
+        </w:rPr>
+        <w:t>8</w:t>
+      </w:r>
+      <w:r>
+        <w:rPr>
+          <w:rFonts w:ascii="Arial" w:hAnsi="Arial" w:cs="Arial"/>
+          <w:sz w:val="16"/>
+          <w:szCs w:val="16"/>
+        </w:rPr>
+        <w:t xml:space="preserve"> initial filters.</w:t>
+      </w:r>
+      <w:r>
+        <w:rPr>
+          <w:rFonts w:ascii="Arial" w:hAnsi="Arial" w:cs="Arial"/>
+          <w:sz w:val="16"/>
+          <w:szCs w:val="16"/>
+        </w:rPr>
+        <w:t xml:space="preserve"> BN: Batch Normalization. </w:t>
       </w:r>
     </w:p>
     <w:p>
@@ -7800,7 +7862,7 @@
 </file>
 
 <file path=word/endnotes.xml><?xml version="1.0" encoding="utf-8"?>
-<w:endnotes xmlns:wpc="http://schemas.microsoft.com/office/word/2010/wordprocessingCanvas" xmlns:cx="http://schemas.microsoft.com/office/drawing/2014/chartex" xmlns:cx1="http://schemas.microsoft.com/office/drawing/2015/9/8/chartex" xmlns:cx2="http://schemas.microsoft.com/office/drawing/2015/10/21/chartex" xmlns:cx3="http://schemas.microsoft.com/office/drawing/2016/5/9/chartex" xmlns:cx4="http://schemas.microsoft.com/office/drawing/2016/5/10/chartex" xmlns:cx5="http://schemas.microsoft.com/office/drawing/2016/5/11/chartex" xmlns:cx6="http://schemas.microsoft.com/office/drawing/2016/5/12/chartex" xmlns:cx7="http://schemas.microsoft.com/office/drawing/2016/5/13/chartex" xmlns:cx8="http://schemas.microsoft.com/office/drawing/2016/5/14/chartex" xmlns:mc="http://schemas.openxmlformats.org/markup-compatibility/2006" xmlns:aink="http://schemas.microsoft.com/office/drawing/2016/ink" xmlns:am3d="http://schemas.microsoft.com/office/drawing/2017/model3d" xmlns:o="urn:schemas-microsoft-com:office:office" xmlns:r="http://schemas.openxmlformats.org/officeDocument/2006/relationships" xmlns:m="http://schemas.openxmlformats.org/officeDocument/2006/math" xmlns:v="urn:schemas-microsoft-com:vml" xmlns:wp14="http://schemas.microsoft.com/office/word/2010/wordprocessingDrawing" xmlns:wp="http://schemas.openxmlformats.org/drawingml/2006/wordprocessingDrawing" xmlns:w10="urn:schemas-microsoft-com:office:word" xmlns:w="http://schemas.openxmlformats.org/wordprocessingml/2006/main" xmlns:w14="http://schemas.microsoft.com/office/word/2010/wordml" xmlns:w15="http://schemas.microsoft.com/office/word/2012/wordml" xmlns:w16cex="http://schemas.microsoft.com/office/word/2018/wordml/cex" xmlns:w16cid="http://schemas.microsoft.com/office/word/2016/wordml/cid" xmlns:w16="http://schemas.microsoft.com/office/word/2018/wordml" xmlns:w16sdtdh="http://schemas.microsoft.com/office/word/2020/wordml/sdtdatahash" xmlns:w16se="http://schemas.microsoft.com/office/word/2015/wordml/symex" xmlns:wpg="http://schemas.microsoft.com/office/word/2010/wordprocessingGroup" xmlns:wpi="http://schemas.microsoft.com/office/word/2010/wordprocessingInk" xmlns:wne="http://schemas.microsoft.com/office/word/2006/wordml" xmlns:wps="http://schemas.microsoft.com/office/word/2010/wordprocessingShape" mc:Ignorable="w14 w15 w16se w16cid w16 w16cex w16sdtdh wp14">
+<w:endnotes xmlns:wpc="http://schemas.microsoft.com/office/word/2010/wordprocessingCanvas" xmlns:cx="http://schemas.microsoft.com/office/drawing/2014/chartex" xmlns:cx1="http://schemas.microsoft.com/office/drawing/2015/9/8/chartex" xmlns:mc="http://schemas.openxmlformats.org/markup-compatibility/2006" xmlns:o="urn:schemas-microsoft-com:office:office" xmlns:r="http://schemas.openxmlformats.org/officeDocument/2006/relationships" xmlns:m="http://schemas.openxmlformats.org/officeDocument/2006/math" xmlns:v="urn:schemas-microsoft-com:vml" xmlns:wp14="http://schemas.microsoft.com/office/word/2010/wordprocessingDrawing" xmlns:wp="http://schemas.openxmlformats.org/drawingml/2006/wordprocessingDrawing" xmlns:w10="urn:schemas-microsoft-com:office:word" xmlns:w="http://schemas.openxmlformats.org/wordprocessingml/2006/main" xmlns:w14="http://schemas.microsoft.com/office/word/2010/wordml" xmlns:w15="http://schemas.microsoft.com/office/word/2012/wordml" xmlns:w16se="http://schemas.microsoft.com/office/word/2015/wordml/symex" xmlns:wpg="http://schemas.microsoft.com/office/word/2010/wordprocessingGroup" xmlns:wpi="http://schemas.microsoft.com/office/word/2010/wordprocessingInk" xmlns:wne="http://schemas.microsoft.com/office/word/2006/wordml" xmlns:wps="http://schemas.microsoft.com/office/word/2010/wordprocessingShape" mc:Ignorable="w14 w15 w16se wp14">
   <w:endnote w:type="separator" w:id="-1">
     <w:p>
       <w:pPr>
@@ -7825,7 +7887,7 @@
 </file>
 
 <file path=word/footer1.xml><?xml version="1.0" encoding="utf-8"?>
-<w:ftr xmlns:wpc="http://schemas.microsoft.com/office/word/2010/wordprocessingCanvas" xmlns:cx="http://schemas.microsoft.com/office/drawing/2014/chartex" xmlns:cx1="http://schemas.microsoft.com/office/drawing/2015/9/8/chartex" xmlns:cx2="http://schemas.microsoft.com/office/drawing/2015/10/21/chartex" xmlns:cx3="http://schemas.microsoft.com/office/drawing/2016/5/9/chartex" xmlns:cx4="http://schemas.microsoft.com/office/drawing/2016/5/10/chartex" xmlns:cx5="http://schemas.microsoft.com/office/drawing/2016/5/11/chartex" xmlns:cx6="http://schemas.microsoft.com/office/drawing/2016/5/12/chartex" xmlns:cx7="http://schemas.microsoft.com/office/drawing/2016/5/13/chartex" xmlns:cx8="http://schemas.microsoft.com/office/drawing/2016/5/14/chartex" xmlns:mc="http://schemas.openxmlformats.org/markup-compatibility/2006" xmlns:aink="http://schemas.microsoft.com/office/drawing/2016/ink" xmlns:am3d="http://schemas.microsoft.com/office/drawing/2017/model3d" xmlns:o="urn:schemas-microsoft-com:office:office" xmlns:r="http://schemas.openxmlformats.org/officeDocument/2006/relationships" xmlns:m="http://schemas.openxmlformats.org/officeDocument/2006/math" xmlns:v="urn:schemas-microsoft-com:vml" xmlns:wp14="http://schemas.microsoft.com/office/word/2010/wordprocessingDrawing" xmlns:wp="http://schemas.openxmlformats.org/drawingml/2006/wordprocessingDrawing" xmlns:w10="urn:schemas-microsoft-com:office:word" xmlns:w="http://schemas.openxmlformats.org/wordprocessingml/2006/main" xmlns:w14="http://schemas.microsoft.com/office/word/2010/wordml" xmlns:w15="http://schemas.microsoft.com/office/word/2012/wordml" xmlns:w16cex="http://schemas.microsoft.com/office/word/2018/wordml/cex" xmlns:w16cid="http://schemas.microsoft.com/office/word/2016/wordml/cid" xmlns:w16="http://schemas.microsoft.com/office/word/2018/wordml" xmlns:w16sdtdh="http://schemas.microsoft.com/office/word/2020/wordml/sdtdatahash" xmlns:w16se="http://schemas.microsoft.com/office/word/2015/wordml/symex" xmlns:wpg="http://schemas.microsoft.com/office/word/2010/wordprocessingGroup" xmlns:wpi="http://schemas.microsoft.com/office/word/2010/wordprocessingInk" xmlns:wne="http://schemas.microsoft.com/office/word/2006/wordml" xmlns:wps="http://schemas.microsoft.com/office/word/2010/wordprocessingShape" mc:Ignorable="w14 w15 w16se w16cid w16 w16cex w16sdtdh wp14">
+<w:ftr xmlns:wpc="http://schemas.microsoft.com/office/word/2010/wordprocessingCanvas" xmlns:cx="http://schemas.microsoft.com/office/drawing/2014/chartex" xmlns:cx1="http://schemas.microsoft.com/office/drawing/2015/9/8/chartex" xmlns:mc="http://schemas.openxmlformats.org/markup-compatibility/2006" xmlns:o="urn:schemas-microsoft-com:office:office" xmlns:r="http://schemas.openxmlformats.org/officeDocument/2006/relationships" xmlns:m="http://schemas.openxmlformats.org/officeDocument/2006/math" xmlns:v="urn:schemas-microsoft-com:vml" xmlns:wp14="http://schemas.microsoft.com/office/word/2010/wordprocessingDrawing" xmlns:wp="http://schemas.openxmlformats.org/drawingml/2006/wordprocessingDrawing" xmlns:w10="urn:schemas-microsoft-com:office:word" xmlns:w="http://schemas.openxmlformats.org/wordprocessingml/2006/main" xmlns:w14="http://schemas.microsoft.com/office/word/2010/wordml" xmlns:w15="http://schemas.microsoft.com/office/word/2012/wordml" xmlns:w16se="http://schemas.microsoft.com/office/word/2015/wordml/symex" xmlns:wpg="http://schemas.microsoft.com/office/word/2010/wordprocessingGroup" xmlns:wpi="http://schemas.microsoft.com/office/word/2010/wordprocessingInk" xmlns:wne="http://schemas.microsoft.com/office/word/2006/wordml" xmlns:wps="http://schemas.microsoft.com/office/word/2010/wordprocessingShape" mc:Ignorable="w14 w15 w16se wp14">
   <w:sdt>
     <w:sdtPr>
       <w:id w:val="-1627229431"/>
@@ -7858,7 +7920,7 @@
           <w:rPr>
             <w:noProof/>
           </w:rPr>
-          <w:t>11</w:t>
+          <w:t>6</w:t>
         </w:r>
         <w:r>
           <w:rPr>
@@ -7878,7 +7940,7 @@
 </file>
 
 <file path=word/footnotes.xml><?xml version="1.0" encoding="utf-8"?>
-<w:footnotes xmlns:wpc="http://schemas.microsoft.com/office/word/2010/wordprocessingCanvas" xmlns:cx="http://schemas.microsoft.com/office/drawing/2014/chartex" xmlns:cx1="http://schemas.microsoft.com/office/drawing/2015/9/8/chartex" xmlns:cx2="http://schemas.microsoft.com/office/drawing/2015/10/21/chartex" xmlns:cx3="http://schemas.microsoft.com/office/drawing/2016/5/9/chartex" xmlns:cx4="http://schemas.microsoft.com/office/drawing/2016/5/10/chartex" xmlns:cx5="http://schemas.microsoft.com/office/drawing/2016/5/11/chartex" xmlns:cx6="http://schemas.microsoft.com/office/drawing/2016/5/12/chartex" xmlns:cx7="http://schemas.microsoft.com/office/drawing/2016/5/13/chartex" xmlns:cx8="http://schemas.microsoft.com/office/drawing/2016/5/14/chartex" xmlns:mc="http://schemas.openxmlformats.org/markup-compatibility/2006" xmlns:aink="http://schemas.microsoft.com/office/drawing/2016/ink" xmlns:am3d="http://schemas.microsoft.com/office/drawing/2017/model3d" xmlns:o="urn:schemas-microsoft-com:office:office" xmlns:r="http://schemas.openxmlformats.org/officeDocument/2006/relationships" xmlns:m="http://schemas.openxmlformats.org/officeDocument/2006/math" xmlns:v="urn:schemas-microsoft-com:vml" xmlns:wp14="http://schemas.microsoft.com/office/word/2010/wordprocessingDrawing" xmlns:wp="http://schemas.openxmlformats.org/drawingml/2006/wordprocessingDrawing" xmlns:w10="urn:schemas-microsoft-com:office:word" xmlns:w="http://schemas.openxmlformats.org/wordprocessingml/2006/main" xmlns:w14="http://schemas.microsoft.com/office/word/2010/wordml" xmlns:w15="http://schemas.microsoft.com/office/word/2012/wordml" xmlns:w16cex="http://schemas.microsoft.com/office/word/2018/wordml/cex" xmlns:w16cid="http://schemas.microsoft.com/office/word/2016/wordml/cid" xmlns:w16="http://schemas.microsoft.com/office/word/2018/wordml" xmlns:w16sdtdh="http://schemas.microsoft.com/office/word/2020/wordml/sdtdatahash" xmlns:w16se="http://schemas.microsoft.com/office/word/2015/wordml/symex" xmlns:wpg="http://schemas.microsoft.com/office/word/2010/wordprocessingGroup" xmlns:wpi="http://schemas.microsoft.com/office/word/2010/wordprocessingInk" xmlns:wne="http://schemas.microsoft.com/office/word/2006/wordml" xmlns:wps="http://schemas.microsoft.com/office/word/2010/wordprocessingShape" mc:Ignorable="w14 w15 w16se w16cid w16 w16cex w16sdtdh wp14">
+<w:footnotes xmlns:wpc="http://schemas.microsoft.com/office/word/2010/wordprocessingCanvas" xmlns:cx="http://schemas.microsoft.com/office/drawing/2014/chartex" xmlns:cx1="http://schemas.microsoft.com/office/drawing/2015/9/8/chartex" xmlns:mc="http://schemas.openxmlformats.org/markup-compatibility/2006" xmlns:o="urn:schemas-microsoft-com:office:office" xmlns:r="http://schemas.openxmlformats.org/officeDocument/2006/relationships" xmlns:m="http://schemas.openxmlformats.org/officeDocument/2006/math" xmlns:v="urn:schemas-microsoft-com:vml" xmlns:wp14="http://schemas.microsoft.com/office/word/2010/wordprocessingDrawing" xmlns:wp="http://schemas.openxmlformats.org/drawingml/2006/wordprocessingDrawing" xmlns:w10="urn:schemas-microsoft-com:office:word" xmlns:w="http://schemas.openxmlformats.org/wordprocessingml/2006/main" xmlns:w14="http://schemas.microsoft.com/office/word/2010/wordml" xmlns:w15="http://schemas.microsoft.com/office/word/2012/wordml" xmlns:w16se="http://schemas.microsoft.com/office/word/2015/wordml/symex" xmlns:wpg="http://schemas.microsoft.com/office/word/2010/wordprocessingGroup" xmlns:wpi="http://schemas.microsoft.com/office/word/2010/wordprocessingInk" xmlns:wne="http://schemas.microsoft.com/office/word/2006/wordml" xmlns:wps="http://schemas.microsoft.com/office/word/2010/wordprocessingShape" mc:Ignorable="w14 w15 w16se wp14">
   <w:footnote w:type="separator" w:id="-1">
     <w:p>
       <w:pPr>
@@ -7903,7 +7965,7 @@
 </file>
 
 <file path=word/numbering.xml><?xml version="1.0" encoding="utf-8"?>
-<w:numbering xmlns:wpc="http://schemas.microsoft.com/office/word/2010/wordprocessingCanvas" xmlns:cx="http://schemas.microsoft.com/office/drawing/2014/chartex" xmlns:cx1="http://schemas.microsoft.com/office/drawing/2015/9/8/chartex" xmlns:cx2="http://schemas.microsoft.com/office/drawing/2015/10/21/chartex" xmlns:cx3="http://schemas.microsoft.com/office/drawing/2016/5/9/chartex" xmlns:cx4="http://schemas.microsoft.com/office/drawing/2016/5/10/chartex" xmlns:cx5="http://schemas.microsoft.com/office/drawing/2016/5/11/chartex" xmlns:cx6="http://schemas.microsoft.com/office/drawing/2016/5/12/chartex" xmlns:cx7="http://schemas.microsoft.com/office/drawing/2016/5/13/chartex" xmlns:cx8="http://schemas.microsoft.com/office/drawing/2016/5/14/chartex" xmlns:mc="http://schemas.openxmlformats.org/markup-compatibility/2006" xmlns:aink="http://schemas.microsoft.com/office/drawing/2016/ink" xmlns:am3d="http://schemas.microsoft.com/office/drawing/2017/model3d" xmlns:o="urn:schemas-microsoft-com:office:office" xmlns:r="http://schemas.openxmlformats.org/officeDocument/2006/relationships" xmlns:m="http://schemas.openxmlformats.org/officeDocument/2006/math" xmlns:v="urn:schemas-microsoft-com:vml" xmlns:wp14="http://schemas.microsoft.com/office/word/2010/wordprocessingDrawing" xmlns:wp="http://schemas.openxmlformats.org/drawingml/2006/wordprocessingDrawing" xmlns:w10="urn:schemas-microsoft-com:office:word" xmlns:w="http://schemas.openxmlformats.org/wordprocessingml/2006/main" xmlns:w14="http://schemas.microsoft.com/office/word/2010/wordml" xmlns:w15="http://schemas.microsoft.com/office/word/2012/wordml" xmlns:w16cex="http://schemas.microsoft.com/office/word/2018/wordml/cex" xmlns:w16cid="http://schemas.microsoft.com/office/word/2016/wordml/cid" xmlns:w16="http://schemas.microsoft.com/office/word/2018/wordml" xmlns:w16sdtdh="http://schemas.microsoft.com/office/word/2020/wordml/sdtdatahash" xmlns:w16se="http://schemas.microsoft.com/office/word/2015/wordml/symex" xmlns:wpg="http://schemas.microsoft.com/office/word/2010/wordprocessingGroup" xmlns:wpi="http://schemas.microsoft.com/office/word/2010/wordprocessingInk" xmlns:wne="http://schemas.microsoft.com/office/word/2006/wordml" xmlns:wps="http://schemas.microsoft.com/office/word/2010/wordprocessingShape" mc:Ignorable="w14 w15 w16se w16cid w16 w16cex w16sdtdh wp14">
+<w:numbering xmlns:wpc="http://schemas.microsoft.com/office/word/2010/wordprocessingCanvas" xmlns:cx="http://schemas.microsoft.com/office/drawing/2014/chartex" xmlns:cx1="http://schemas.microsoft.com/office/drawing/2015/9/8/chartex" xmlns:mc="http://schemas.openxmlformats.org/markup-compatibility/2006" xmlns:o="urn:schemas-microsoft-com:office:office" xmlns:r="http://schemas.openxmlformats.org/officeDocument/2006/relationships" xmlns:m="http://schemas.openxmlformats.org/officeDocument/2006/math" xmlns:v="urn:schemas-microsoft-com:vml" xmlns:wp14="http://schemas.microsoft.com/office/word/2010/wordprocessingDrawing" xmlns:wp="http://schemas.openxmlformats.org/drawingml/2006/wordprocessingDrawing" xmlns:w10="urn:schemas-microsoft-com:office:word" xmlns:w="http://schemas.openxmlformats.org/wordprocessingml/2006/main" xmlns:w14="http://schemas.microsoft.com/office/word/2010/wordml" xmlns:w15="http://schemas.microsoft.com/office/word/2012/wordml" xmlns:w16se="http://schemas.microsoft.com/office/word/2015/wordml/symex" xmlns:wpg="http://schemas.microsoft.com/office/word/2010/wordprocessingGroup" xmlns:wpi="http://schemas.microsoft.com/office/word/2010/wordprocessingInk" xmlns:wne="http://schemas.microsoft.com/office/word/2006/wordml" xmlns:wps="http://schemas.microsoft.com/office/word/2010/wordprocessingShape" mc:Ignorable="w14 w15 w16se wp14">
   <w:abstractNum w:abstractNumId="0" w15:restartNumberingAfterBreak="0">
     <w:nsid w:val="0EB13DCE"/>
     <w:multiLevelType w:val="hybridMultilevel"/>
@@ -8553,15 +8615,18 @@
 </file>
 
 <file path=word/people.xml><?xml version="1.0" encoding="utf-8"?>
-<w15:people xmlns:wpc="http://schemas.microsoft.com/office/word/2010/wordprocessingCanvas" xmlns:cx="http://schemas.microsoft.com/office/drawing/2014/chartex" xmlns:cx1="http://schemas.microsoft.com/office/drawing/2015/9/8/chartex" xmlns:cx2="http://schemas.microsoft.com/office/drawing/2015/10/21/chartex" xmlns:cx3="http://schemas.microsoft.com/office/drawing/2016/5/9/chartex" xmlns:cx4="http://schemas.microsoft.com/office/drawing/2016/5/10/chartex" xmlns:cx5="http://schemas.microsoft.com/office/drawing/2016/5/11/chartex" xmlns:cx6="http://schemas.microsoft.com/office/drawing/2016/5/12/chartex" xmlns:cx7="http://schemas.microsoft.com/office/drawing/2016/5/13/chartex" xmlns:cx8="http://schemas.microsoft.com/office/drawing/2016/5/14/chartex" xmlns:mc="http://schemas.openxmlformats.org/markup-compatibility/2006" xmlns:aink="http://schemas.microsoft.com/office/drawing/2016/ink" xmlns:am3d="http://schemas.microsoft.com/office/drawing/2017/model3d" xmlns:o="urn:schemas-microsoft-com:office:office" xmlns:r="http://schemas.openxmlformats.org/officeDocument/2006/relationships" xmlns:m="http://schemas.openxmlformats.org/officeDocument/2006/math" xmlns:v="urn:schemas-microsoft-com:vml" xmlns:wp14="http://schemas.microsoft.com/office/word/2010/wordprocessingDrawing" xmlns:wp="http://schemas.openxmlformats.org/drawingml/2006/wordprocessingDrawing" xmlns:w10="urn:schemas-microsoft-com:office:word" xmlns:w="http://schemas.openxmlformats.org/wordprocessingml/2006/main" xmlns:w14="http://schemas.microsoft.com/office/word/2010/wordml" xmlns:w15="http://schemas.microsoft.com/office/word/2012/wordml" xmlns:w16cex="http://schemas.microsoft.com/office/word/2018/wordml/cex" xmlns:w16cid="http://schemas.microsoft.com/office/word/2016/wordml/cid" xmlns:w16="http://schemas.microsoft.com/office/word/2018/wordml" xmlns:w16sdtdh="http://schemas.microsoft.com/office/word/2020/wordml/sdtdatahash" xmlns:w16se="http://schemas.microsoft.com/office/word/2015/wordml/symex" xmlns:wpg="http://schemas.microsoft.com/office/word/2010/wordprocessingGroup" xmlns:wpi="http://schemas.microsoft.com/office/word/2010/wordprocessingInk" xmlns:wne="http://schemas.microsoft.com/office/word/2006/wordml" xmlns:wps="http://schemas.microsoft.com/office/word/2010/wordprocessingShape" mc:Ignorable="w14 w15 w16se w16cid w16 w16cex w16sdtdh wp14">
+<w15:people xmlns:wpc="http://schemas.microsoft.com/office/word/2010/wordprocessingCanvas" xmlns:cx="http://schemas.microsoft.com/office/drawing/2014/chartex" xmlns:cx1="http://schemas.microsoft.com/office/drawing/2015/9/8/chartex" xmlns:mc="http://schemas.openxmlformats.org/markup-compatibility/2006" xmlns:o="urn:schemas-microsoft-com:office:office" xmlns:r="http://schemas.openxmlformats.org/officeDocument/2006/relationships" xmlns:m="http://schemas.openxmlformats.org/officeDocument/2006/math" xmlns:v="urn:schemas-microsoft-com:vml" xmlns:wp14="http://schemas.microsoft.com/office/word/2010/wordprocessingDrawing" xmlns:wp="http://schemas.openxmlformats.org/drawingml/2006/wordprocessingDrawing" xmlns:w10="urn:schemas-microsoft-com:office:word" xmlns:w="http://schemas.openxmlformats.org/wordprocessingml/2006/main" xmlns:w14="http://schemas.microsoft.com/office/word/2010/wordml" xmlns:w15="http://schemas.microsoft.com/office/word/2012/wordml" xmlns:w16se="http://schemas.microsoft.com/office/word/2015/wordml/symex" xmlns:wpg="http://schemas.microsoft.com/office/word/2010/wordprocessingGroup" xmlns:wpi="http://schemas.microsoft.com/office/word/2010/wordprocessingInk" xmlns:wne="http://schemas.microsoft.com/office/word/2006/wordml" xmlns:wps="http://schemas.microsoft.com/office/word/2010/wordprocessingShape" mc:Ignorable="w14 w15 w16se wp14">
   <w15:person w15:author="Anderson, Brian">
     <w15:presenceInfo w15:providerId="None" w15:userId="Anderson, Brian"/>
+  </w15:person>
+  <w15:person w15:author="Anderson, Brian [2]">
+    <w15:presenceInfo w15:providerId="AD" w15:userId="S-1-5-21-503695880-695175589-3595387526-1026439"/>
   </w15:person>
 </w15:people>
 </file>
 
 <file path=word/styles.xml><?xml version="1.0" encoding="utf-8"?>
-<w:styles xmlns:mc="http://schemas.openxmlformats.org/markup-compatibility/2006" xmlns:r="http://schemas.openxmlformats.org/officeDocument/2006/relationships" xmlns:w="http://schemas.openxmlformats.org/wordprocessingml/2006/main" xmlns:w14="http://schemas.microsoft.com/office/word/2010/wordml" xmlns:w15="http://schemas.microsoft.com/office/word/2012/wordml" xmlns:w16cex="http://schemas.microsoft.com/office/word/2018/wordml/cex" xmlns:w16cid="http://schemas.microsoft.com/office/word/2016/wordml/cid" xmlns:w16="http://schemas.microsoft.com/office/word/2018/wordml" xmlns:w16sdtdh="http://schemas.microsoft.com/office/word/2020/wordml/sdtdatahash" xmlns:w16se="http://schemas.microsoft.com/office/word/2015/wordml/symex" mc:Ignorable="w14 w15 w16se w16cid w16 w16cex w16sdtdh">
+<w:styles xmlns:mc="http://schemas.openxmlformats.org/markup-compatibility/2006" xmlns:r="http://schemas.openxmlformats.org/officeDocument/2006/relationships" xmlns:w="http://schemas.openxmlformats.org/wordprocessingml/2006/main" xmlns:w14="http://schemas.microsoft.com/office/word/2010/wordml" xmlns:w15="http://schemas.microsoft.com/office/word/2012/wordml" xmlns:w16se="http://schemas.microsoft.com/office/word/2015/wordml/symex" mc:Ignorable="w14 w15 w16se">
   <w:docDefaults>
     <w:rPrDefault>
       <w:rPr>
@@ -8577,7 +8642,7 @@
       </w:pPr>
     </w:pPrDefault>
   </w:docDefaults>
-  <w:latentStyles w:defLockedState="0" w:defUIPriority="99" w:defSemiHidden="0" w:defUnhideWhenUsed="0" w:defQFormat="0" w:count="376">
+  <w:latentStyles w:defLockedState="0" w:defUIPriority="99" w:defSemiHidden="0" w:defUnhideWhenUsed="0" w:defQFormat="0" w:count="371">
     <w:lsdException w:name="Normal" w:uiPriority="0" w:qFormat="1"/>
     <w:lsdException w:name="heading 1" w:uiPriority="9" w:qFormat="1"/>
     <w:lsdException w:name="heading 2" w:semiHidden="1" w:uiPriority="9" w:unhideWhenUsed="1" w:qFormat="1"/>
@@ -8683,6 +8748,7 @@
     <w:lsdException w:name="HTML Sample" w:semiHidden="1" w:unhideWhenUsed="1"/>
     <w:lsdException w:name="HTML Typewriter" w:semiHidden="1" w:unhideWhenUsed="1"/>
     <w:lsdException w:name="HTML Variable" w:semiHidden="1" w:unhideWhenUsed="1"/>
+    <w:lsdException w:name="Normal Table" w:semiHidden="1" w:unhideWhenUsed="1"/>
     <w:lsdException w:name="annotation subject" w:semiHidden="1" w:unhideWhenUsed="1"/>
     <w:lsdException w:name="No List" w:semiHidden="1" w:unhideWhenUsed="1"/>
     <w:lsdException w:name="Outline List 1" w:semiHidden="1" w:unhideWhenUsed="1"/>
@@ -8725,8 +8791,11 @@
     <w:lsdException w:name="Table Contemporary" w:semiHidden="1" w:unhideWhenUsed="1"/>
     <w:lsdException w:name="Table Elegant" w:semiHidden="1" w:unhideWhenUsed="1"/>
     <w:lsdException w:name="Table Professional" w:semiHidden="1" w:unhideWhenUsed="1"/>
+    <w:lsdException w:name="Table Subtle 1" w:semiHidden="1" w:unhideWhenUsed="1"/>
     <w:lsdException w:name="Table Subtle 2" w:semiHidden="1" w:unhideWhenUsed="1"/>
     <w:lsdException w:name="Table Web 1" w:semiHidden="1" w:unhideWhenUsed="1"/>
+    <w:lsdException w:name="Table Web 2" w:semiHidden="1" w:unhideWhenUsed="1"/>
+    <w:lsdException w:name="Table Web 3" w:semiHidden="1" w:unhideWhenUsed="1"/>
     <w:lsdException w:name="Balloon Text" w:semiHidden="1" w:unhideWhenUsed="1"/>
     <w:lsdException w:name="Table Grid" w:uiPriority="39"/>
     <w:lsdException w:name="Table Theme" w:semiHidden="1" w:unhideWhenUsed="1"/>
@@ -8945,11 +9014,6 @@
     <w:lsdException w:name="List Table 5 Dark Accent 6" w:uiPriority="50"/>
     <w:lsdException w:name="List Table 6 Colorful Accent 6" w:uiPriority="51"/>
     <w:lsdException w:name="List Table 7 Colorful Accent 6" w:uiPriority="52"/>
-    <w:lsdException w:name="Mention" w:semiHidden="1" w:unhideWhenUsed="1"/>
-    <w:lsdException w:name="Smart Hyperlink" w:semiHidden="1" w:unhideWhenUsed="1"/>
-    <w:lsdException w:name="Hashtag" w:semiHidden="1" w:unhideWhenUsed="1"/>
-    <w:lsdException w:name="Unresolved Mention" w:semiHidden="1" w:unhideWhenUsed="1"/>
-    <w:lsdException w:name="Smart Link" w:semiHidden="1" w:unhideWhenUsed="1"/>
   </w:latentStyles>
   <w:style w:type="paragraph" w:default="1" w:styleId="Normal">
     <w:name w:val="Normal"/>
@@ -9654,7 +9718,7 @@
 </file>
 
 <file path=customXml/itemProps1.xml><?xml version="1.0" encoding="utf-8"?>
-<ds:datastoreItem xmlns:ds="http://schemas.openxmlformats.org/officeDocument/2006/customXml" ds:itemID="{82C0C65B-669D-4768-99BD-FA8CC8D396C1}">
+<ds:datastoreItem xmlns:ds="http://schemas.openxmlformats.org/officeDocument/2006/customXml" ds:itemID="{DD69971C-4130-4443-A525-B65E5DCB0DA6}">
   <ds:schemaRefs>
     <ds:schemaRef ds:uri="http://schemas.openxmlformats.org/officeDocument/2006/bibliography"/>
   </ds:schemaRefs>

</xml_diff>